<commit_message>
Alterações no documento gerenciador de tarefas
</commit_message>
<xml_diff>
--- a/Gerenciador de Tarefas.docx
+++ b/Gerenciador de Tarefas.docx
@@ -140,9 +140,48 @@
       </w:r>
     </w:p>
     <w:p>
+      <w:pPr>
+        <w:spacing w:before="100" w:beforeAutospacing="1" w:after="100" w:afterAutospacing="1" w:line="300" w:lineRule="atLeast"/>
+        <w:rPr>
+          <w:rFonts w:ascii="Segoe UI" w:eastAsia="Times New Roman" w:hAnsi="Segoe UI" w:cs="Segoe UI"/>
+          <w:sz w:val="21"/>
+          <w:szCs w:val="21"/>
+          <w:lang w:eastAsia="pt-BR"/>
+        </w:rPr>
+      </w:pPr>
+      <w:r>
+        <w:rPr>
+          <w:rFonts w:ascii="Segoe UI" w:eastAsia="Times New Roman" w:hAnsi="Segoe UI" w:cs="Segoe UI"/>
+          <w:sz w:val="21"/>
+          <w:szCs w:val="21"/>
+          <w:lang w:eastAsia="pt-BR"/>
+        </w:rPr>
+        <w:t>Hgfjghfjgfjfjfjdjdyufghidfguhi7y6ugfuyebnfuierht7ierhg9ertugjoidfgjnortijghnotruijho</w:t>
+      </w:r>
+    </w:p>
+    <w:p>
+      <w:pPr>
+        <w:spacing w:before="100" w:beforeAutospacing="1" w:after="100" w:afterAutospacing="1" w:line="300" w:lineRule="atLeast"/>
+        <w:rPr>
+          <w:rFonts w:ascii="Segoe UI" w:eastAsia="Times New Roman" w:hAnsi="Segoe UI" w:cs="Segoe UI"/>
+          <w:sz w:val="21"/>
+          <w:szCs w:val="21"/>
+          <w:lang w:eastAsia="pt-BR"/>
+        </w:rPr>
+      </w:pPr>
+      <w:r>
+        <w:rPr>
+          <w:rFonts w:ascii="Segoe UI" w:eastAsia="Times New Roman" w:hAnsi="Segoe UI" w:cs="Segoe UI"/>
+          <w:sz w:val="21"/>
+          <w:szCs w:val="21"/>
+          <w:lang w:eastAsia="pt-BR"/>
+        </w:rPr>
+        <w:t>Yghijkbjh5494+65+897++9854+5+625+58+95+954+t6h2fg+hrthrtyhjfgbngjh1j96ty/8j74ty65j1ty65j4ty68jhfhjfgnyjyjytjytj4tyj5tyu4j5th1j65ty1j6ty5j</w:t>
+      </w:r>
       <w:bookmarkStart w:id="0" w:name="_GoBack"/>
       <w:bookmarkEnd w:id="0"/>
     </w:p>
+    <w:p/>
     <w:sectPr>
       <w:pgSz w:w="11906" w:h="16838"/>
       <w:pgMar w:top="1417" w:right="1701" w:bottom="1417" w:left="1701" w:header="708" w:footer="708" w:gutter="0"/>
@@ -1113,20 +1152,20 @@
 </file>
 
 <file path=customXml/item2.xml><?xml version="1.0" encoding="utf-8"?>
+<p:properties xmlns:p="http://schemas.microsoft.com/office/2006/metadata/properties" xmlns:xsi="http://www.w3.org/2001/XMLSchema-instance" xmlns:pc="http://schemas.microsoft.com/office/infopath/2007/PartnerControls">
+  <documentManagement>
+    <_activity xmlns="8fd7a463-7b6d-4428-9c81-5610aecf0dc2" xsi:nil="true"/>
+  </documentManagement>
+</p:properties>
+</file>
+
+<file path=customXml/item3.xml><?xml version="1.0" encoding="utf-8"?>
 <?mso-contentType ?>
 <FormTemplates xmlns="http://schemas.microsoft.com/sharepoint/v3/contenttype/forms">
   <Display>DocumentLibraryForm</Display>
   <Edit>DocumentLibraryForm</Edit>
   <New>DocumentLibraryForm</New>
 </FormTemplates>
-</file>
-
-<file path=customXml/item3.xml><?xml version="1.0" encoding="utf-8"?>
-<p:properties xmlns:p="http://schemas.microsoft.com/office/2006/metadata/properties" xmlns:xsi="http://www.w3.org/2001/XMLSchema-instance" xmlns:pc="http://schemas.microsoft.com/office/infopath/2007/PartnerControls">
-  <documentManagement>
-    <_activity xmlns="8fd7a463-7b6d-4428-9c81-5610aecf0dc2" xsi:nil="true"/>
-  </documentManagement>
-</p:properties>
 </file>
 
 <file path=customXml/itemProps1.xml><?xml version="1.0" encoding="utf-8"?>
@@ -1148,25 +1187,25 @@
 </file>
 
 <file path=customXml/itemProps2.xml><?xml version="1.0" encoding="utf-8"?>
+<ds:datastoreItem xmlns:ds="http://schemas.openxmlformats.org/officeDocument/2006/customXml" ds:itemID="{AFBE2443-93DA-40BD-967C-9CF8402C6444}">
+  <ds:schemaRefs>
+    <ds:schemaRef ds:uri="http://schemas.microsoft.com/office/2006/metadata/properties"/>
+    <ds:schemaRef ds:uri="http://purl.org/dc/elements/1.1/"/>
+    <ds:schemaRef ds:uri="http://schemas.microsoft.com/office/infopath/2007/PartnerControls"/>
+    <ds:schemaRef ds:uri="http://schemas.microsoft.com/office/2006/documentManagement/types"/>
+    <ds:schemaRef ds:uri="http://purl.org/dc/terms/"/>
+    <ds:schemaRef ds:uri="http://purl.org/dc/dcmitype/"/>
+    <ds:schemaRef ds:uri="8fd7a463-7b6d-4428-9c81-5610aecf0dc2"/>
+    <ds:schemaRef ds:uri="http://schemas.openxmlformats.org/package/2006/metadata/core-properties"/>
+    <ds:schemaRef ds:uri="http://www.w3.org/XML/1998/namespace"/>
+  </ds:schemaRefs>
+</ds:datastoreItem>
+</file>
+
+<file path=customXml/itemProps3.xml><?xml version="1.0" encoding="utf-8"?>
 <ds:datastoreItem xmlns:ds="http://schemas.openxmlformats.org/officeDocument/2006/customXml" ds:itemID="{FB3175E8-45DD-4405-A18B-CE222CE5E99C}">
   <ds:schemaRefs>
     <ds:schemaRef ds:uri="http://schemas.microsoft.com/sharepoint/v3/contenttype/forms"/>
   </ds:schemaRefs>
 </ds:datastoreItem>
-</file>
-
-<file path=customXml/itemProps3.xml><?xml version="1.0" encoding="utf-8"?>
-<ds:datastoreItem xmlns:ds="http://schemas.openxmlformats.org/officeDocument/2006/customXml" ds:itemID="{AFBE2443-93DA-40BD-967C-9CF8402C6444}">
-  <ds:schemaRefs>
-    <ds:schemaRef ds:uri="http://schemas.microsoft.com/office/2006/metadata/properties"/>
-    <ds:schemaRef ds:uri="http://schemas.openxmlformats.org/package/2006/metadata/core-properties"/>
-    <ds:schemaRef ds:uri="http://schemas.microsoft.com/office/2006/documentManagement/types"/>
-    <ds:schemaRef ds:uri="http://www.w3.org/XML/1998/namespace"/>
-    <ds:schemaRef ds:uri="http://purl.org/dc/elements/1.1/"/>
-    <ds:schemaRef ds:uri="http://purl.org/dc/terms/"/>
-    <ds:schemaRef ds:uri="http://purl.org/dc/dcmitype/"/>
-    <ds:schemaRef ds:uri="8fd7a463-7b6d-4428-9c81-5610aecf0dc2"/>
-    <ds:schemaRef ds:uri="http://schemas.microsoft.com/office/infopath/2007/PartnerControls"/>
-  </ds:schemaRefs>
-</ds:datastoreItem>
 </file>
</xml_diff>

<commit_message>
Atualizando conteúdo do gerenciador de tarefas
</commit_message>
<xml_diff>
--- a/Gerenciador de Tarefas.docx
+++ b/Gerenciador de Tarefas.docx
@@ -96,8 +96,8 @@
           <w:lang w:eastAsia="pt-BR"/>
         </w:rPr>
         <w:br/>
-        <w:t>O sistema permite visualizar o andamento de cada tarefa.</w:t>
-      </w:r>
+      </w:r>
+      <w:bookmarkStart w:id="0" w:name="_GoBack"/>
       <w:r>
         <w:rPr>
           <w:rFonts w:ascii="Segoe UI" w:eastAsia="Times New Roman" w:hAnsi="Segoe UI" w:cs="Segoe UI"/>
@@ -105,7 +105,25 @@
           <w:szCs w:val="21"/>
           <w:lang w:eastAsia="pt-BR"/>
         </w:rPr>
+        <w:t>O sistema permite visualizar o andamento de cada tarefa.</w:t>
+      </w:r>
+      <w:r>
+        <w:rPr>
+          <w:rFonts w:ascii="Segoe UI" w:eastAsia="Times New Roman" w:hAnsi="Segoe UI" w:cs="Segoe UI"/>
+          <w:sz w:val="21"/>
+          <w:szCs w:val="21"/>
+          <w:lang w:eastAsia="pt-BR"/>
+        </w:rPr>
         <w:br/>
+      </w:r>
+      <w:bookmarkEnd w:id="0"/>
+      <w:r>
+        <w:rPr>
+          <w:rFonts w:ascii="Segoe UI" w:eastAsia="Times New Roman" w:hAnsi="Segoe UI" w:cs="Segoe UI"/>
+          <w:sz w:val="21"/>
+          <w:szCs w:val="21"/>
+          <w:lang w:eastAsia="pt-BR"/>
+        </w:rPr>
         <w:t>Também ajuda a evitar esquecimentos e atrasos.</w:t>
       </w:r>
       <w:r>
@@ -144,42 +162,26 @@
         <w:spacing w:before="100" w:beforeAutospacing="1" w:after="100" w:afterAutospacing="1" w:line="300" w:lineRule="atLeast"/>
         <w:rPr>
           <w:rFonts w:ascii="Segoe UI" w:eastAsia="Times New Roman" w:hAnsi="Segoe UI" w:cs="Segoe UI"/>
-          <w:sz w:val="21"/>
-          <w:szCs w:val="21"/>
+          <w:b/>
+          <w:color w:val="C00000"/>
+          <w:sz w:val="56"/>
+          <w:szCs w:val="56"/>
+          <w:u w:val="single"/>
           <w:lang w:eastAsia="pt-BR"/>
         </w:rPr>
       </w:pPr>
       <w:r>
         <w:rPr>
           <w:rFonts w:ascii="Segoe UI" w:eastAsia="Times New Roman" w:hAnsi="Segoe UI" w:cs="Segoe UI"/>
-          <w:sz w:val="21"/>
-          <w:szCs w:val="21"/>
+          <w:b/>
+          <w:color w:val="C00000"/>
+          <w:sz w:val="56"/>
+          <w:szCs w:val="56"/>
+          <w:u w:val="single"/>
           <w:lang w:eastAsia="pt-BR"/>
         </w:rPr>
         <w:t>Hgfjghfjgfjfjfjdjdyufghidfguhi7y6ugfuyebnfuierht7ierhg9ertugjoidfgjnortijghnotruijho</w:t>
       </w:r>
-    </w:p>
-    <w:p>
-      <w:pPr>
-        <w:spacing w:before="100" w:beforeAutospacing="1" w:after="100" w:afterAutospacing="1" w:line="300" w:lineRule="atLeast"/>
-        <w:rPr>
-          <w:rFonts w:ascii="Segoe UI" w:eastAsia="Times New Roman" w:hAnsi="Segoe UI" w:cs="Segoe UI"/>
-          <w:sz w:val="21"/>
-          <w:szCs w:val="21"/>
-          <w:lang w:eastAsia="pt-BR"/>
-        </w:rPr>
-      </w:pPr>
-      <w:r>
-        <w:rPr>
-          <w:rFonts w:ascii="Segoe UI" w:eastAsia="Times New Roman" w:hAnsi="Segoe UI" w:cs="Segoe UI"/>
-          <w:sz w:val="21"/>
-          <w:szCs w:val="21"/>
-          <w:lang w:eastAsia="pt-BR"/>
-        </w:rPr>
-        <w:t>Yghijkbjh5494+65+897++9854+5+625+58+95+954+t6h2fg+hrthrtyhjfgbngjh1j96ty/8j74ty65j1ty65j4ty68jhfhjfgnyjyjytjytj4tyj5tyu4j5th1j65ty1j6ty5j</w:t>
-      </w:r>
-      <w:bookmarkStart w:id="0" w:name="_GoBack"/>
-      <w:bookmarkEnd w:id="0"/>
     </w:p>
     <w:p/>
     <w:sectPr>
@@ -1152,20 +1154,20 @@
 </file>
 
 <file path=customXml/item2.xml><?xml version="1.0" encoding="utf-8"?>
-<p:properties xmlns:p="http://schemas.microsoft.com/office/2006/metadata/properties" xmlns:xsi="http://www.w3.org/2001/XMLSchema-instance" xmlns:pc="http://schemas.microsoft.com/office/infopath/2007/PartnerControls">
-  <documentManagement>
-    <_activity xmlns="8fd7a463-7b6d-4428-9c81-5610aecf0dc2" xsi:nil="true"/>
-  </documentManagement>
-</p:properties>
-</file>
-
-<file path=customXml/item3.xml><?xml version="1.0" encoding="utf-8"?>
 <?mso-contentType ?>
 <FormTemplates xmlns="http://schemas.microsoft.com/sharepoint/v3/contenttype/forms">
   <Display>DocumentLibraryForm</Display>
   <Edit>DocumentLibraryForm</Edit>
   <New>DocumentLibraryForm</New>
 </FormTemplates>
+</file>
+
+<file path=customXml/item3.xml><?xml version="1.0" encoding="utf-8"?>
+<p:properties xmlns:p="http://schemas.microsoft.com/office/2006/metadata/properties" xmlns:xsi="http://www.w3.org/2001/XMLSchema-instance" xmlns:pc="http://schemas.microsoft.com/office/infopath/2007/PartnerControls">
+  <documentManagement>
+    <_activity xmlns="8fd7a463-7b6d-4428-9c81-5610aecf0dc2" xsi:nil="true"/>
+  </documentManagement>
+</p:properties>
 </file>
 
 <file path=customXml/itemProps1.xml><?xml version="1.0" encoding="utf-8"?>
@@ -1187,25 +1189,25 @@
 </file>
 
 <file path=customXml/itemProps2.xml><?xml version="1.0" encoding="utf-8"?>
-<ds:datastoreItem xmlns:ds="http://schemas.openxmlformats.org/officeDocument/2006/customXml" ds:itemID="{AFBE2443-93DA-40BD-967C-9CF8402C6444}">
+<ds:datastoreItem xmlns:ds="http://schemas.openxmlformats.org/officeDocument/2006/customXml" ds:itemID="{FB3175E8-45DD-4405-A18B-CE222CE5E99C}">
   <ds:schemaRefs>
-    <ds:schemaRef ds:uri="http://schemas.microsoft.com/office/2006/metadata/properties"/>
-    <ds:schemaRef ds:uri="http://purl.org/dc/elements/1.1/"/>
-    <ds:schemaRef ds:uri="http://schemas.microsoft.com/office/infopath/2007/PartnerControls"/>
-    <ds:schemaRef ds:uri="http://schemas.microsoft.com/office/2006/documentManagement/types"/>
-    <ds:schemaRef ds:uri="http://purl.org/dc/terms/"/>
-    <ds:schemaRef ds:uri="http://purl.org/dc/dcmitype/"/>
-    <ds:schemaRef ds:uri="8fd7a463-7b6d-4428-9c81-5610aecf0dc2"/>
-    <ds:schemaRef ds:uri="http://schemas.openxmlformats.org/package/2006/metadata/core-properties"/>
-    <ds:schemaRef ds:uri="http://www.w3.org/XML/1998/namespace"/>
+    <ds:schemaRef ds:uri="http://schemas.microsoft.com/sharepoint/v3/contenttype/forms"/>
   </ds:schemaRefs>
 </ds:datastoreItem>
 </file>
 
 <file path=customXml/itemProps3.xml><?xml version="1.0" encoding="utf-8"?>
-<ds:datastoreItem xmlns:ds="http://schemas.openxmlformats.org/officeDocument/2006/customXml" ds:itemID="{FB3175E8-45DD-4405-A18B-CE222CE5E99C}">
+<ds:datastoreItem xmlns:ds="http://schemas.openxmlformats.org/officeDocument/2006/customXml" ds:itemID="{AFBE2443-93DA-40BD-967C-9CF8402C6444}">
   <ds:schemaRefs>
-    <ds:schemaRef ds:uri="http://schemas.microsoft.com/sharepoint/v3/contenttype/forms"/>
+    <ds:schemaRef ds:uri="http://www.w3.org/XML/1998/namespace"/>
+    <ds:schemaRef ds:uri="http://schemas.microsoft.com/office/2006/documentManagement/types"/>
+    <ds:schemaRef ds:uri="http://schemas.microsoft.com/office/2006/metadata/properties"/>
+    <ds:schemaRef ds:uri="http://purl.org/dc/terms/"/>
+    <ds:schemaRef ds:uri="http://schemas.microsoft.com/office/infopath/2007/PartnerControls"/>
+    <ds:schemaRef ds:uri="http://purl.org/dc/elements/1.1/"/>
+    <ds:schemaRef ds:uri="http://schemas.openxmlformats.org/package/2006/metadata/core-properties"/>
+    <ds:schemaRef ds:uri="8fd7a463-7b6d-4428-9c81-5610aecf0dc2"/>
+    <ds:schemaRef ds:uri="http://purl.org/dc/dcmitype/"/>
   </ds:schemaRefs>
 </ds:datastoreItem>
 </file>
</xml_diff>